<commit_message>
trim(rmk9): rebuild final 15-page document
</commit_message>
<xml_diff>
--- a/rmk-pkk-pert9-income-statement/output/01079_Dzaki Muhammad Yusfian_RMK Pert. 9.docx
+++ b/rmk-pkk-pert9-income-statement/output/01079_Dzaki Muhammad Yusfian_RMK Pert. 9.docx
@@ -1875,7 +1875,7 @@
           <w:i w:val="0"/>
           <w:sz w:val="24"/>
         </w:rPr>
-        <w:t xml:space="preserve">Pertanyaan "kapan suatu pendapatan menjadi pendapatan?" berjawaban teoretis jernih namun praktis berduri. Secara ideal, </w:t>
+        <w:t xml:space="preserve">Secara ideal, </w:t>
       </w:r>
       <w:r>
         <w:rPr>
@@ -1893,7 +1893,7 @@
           <w:i w:val="0"/>
           <w:sz w:val="24"/>
         </w:rPr>
-        <w:t xml:space="preserve"> diidentifikasikan dengan periode saat aktivitas ekonomi utama untuk menciptakan dan melepas barang serta jasa dirampungkan (Wolk et al., 2017, PDF hlm. 4). Masalahnya, penyelesaian aktivitas itu dan kemampuan mengukurnya secara objektif kerap terjadi pada periode berbeda. Di sinilah cita-cita teoretis berbenturan dengan </w:t>
+        <w:t xml:space="preserve"> diidentifikasikan dengan periode saat aktivitas ekonomi utama menciptakan dan melepas barang serta jasa dirampungkan, namun penyelesaian itu dan kemampuan mengukurnya secara objektif kerap terjadi pada periode berbeda (Wolk et al., 2017, PDF hlm. 4). Di sinilah cita-cita teoretis berbenturan dengan </w:t>
       </w:r>
       <w:r>
         <w:rPr>
@@ -1929,7 +1929,7 @@
           <w:i w:val="0"/>
           <w:sz w:val="24"/>
         </w:rPr>
-        <w:t xml:space="preserve">): selama pengukuran terverifikasi belum dapat dilakukan, pendapatan tidak boleh diakui. Wolk dan kolega menilai SFAC No. 5, yang seharusnya mengatur pengakuan, hanya mengulang konsep terdahulu secara </w:t>
+        <w:t xml:space="preserve">): selama pengukuran terverifikasi belum dapat dilakukan, pendapatan tidak boleh diakui. SFAC No. 5 yang mengatur pengakuan dinilai Wolk hanya mengulang konsep terdahulu secara </w:t>
       </w:r>
       <w:r>
         <w:rPr>
@@ -1947,7 +1947,7 @@
           <w:i w:val="0"/>
           <w:sz w:val="24"/>
         </w:rPr>
-        <w:t xml:space="preserve"> dan tidak banyak menolong (Wolk et al., 2017, PDF hlm. 4). Ketegangan relevansi versus reliabilitas inilah yang menstrukturkan praktik pengakuan.</w:t>
+        <w:t>. Ketegangan relevansi versus reliabilitas inilah yang menstrukturkan praktiknya.</w:t>
       </w:r>
     </w:p>
     <w:p>
@@ -2007,7 +2007,7 @@
           <w:i w:val="0"/>
           <w:sz w:val="24"/>
         </w:rPr>
-        <w:t>pada saat produksi selesai</w:t>
+        <w:t>produksi selesai</w:t>
       </w:r>
       <w:r>
         <w:rPr>
@@ -2043,7 +2043,7 @@
           <w:i w:val="0"/>
           <w:sz w:val="24"/>
         </w:rPr>
-        <w:t>pada saat penjualan</w:t>
+        <w:t>penjualan</w:t>
       </w:r>
       <w:r>
         <w:rPr>
@@ -2079,7 +2079,7 @@
           <w:i w:val="0"/>
           <w:sz w:val="24"/>
         </w:rPr>
-        <w:t>pada saat kas terkumpul</w:t>
+        <w:t>kas terkumpul</w:t>
       </w:r>
       <w:r>
         <w:rPr>
@@ -2200,7 +2200,7 @@
           <w:i w:val="0"/>
           <w:sz w:val="24"/>
         </w:rPr>
-        <w:t xml:space="preserve">Masing-masing titik disahkan secara selektif. Pengakuan selama produksi diterapkan pada kontrak jangka panjang seperti konstruksi (ARB 45 dan SOP 81-1), dengan syarat estimasi andal atas kemajuan dan biaya. Pengakuan saat produksi selesai diizinkan bagi sebagian operasi pertanian dan pertambangan (ARB 43, Bab 4) ketika produk yang dapat dipertukarkan memiliki pasar segera pada harga terkutip. Pengakuan saat penjualan, ketika hak hukum berpindah, adalah </w:t>
+        <w:t xml:space="preserve">Masing-masing disahkan selektif. Pengakuan selama produksi diterapkan pada kontrak jangka panjang seperti konstruksi (ARB 45 dan SOP 81-1), bersyarat estimasi andal atas kemajuan dan biaya. Pengakuan saat produksi selesai diizinkan bagi sebagian operasi pertanian dan pertambangan (ARB 43, Bab 4) ketika produk berpasar segera pada harga terkutip. Pengakuan saat penjualan, ketika hak hukum berpindah, adalah </w:t>
       </w:r>
       <w:r>
         <w:rPr>
@@ -2218,7 +2218,7 @@
           <w:i w:val="0"/>
           <w:sz w:val="24"/>
         </w:rPr>
-        <w:t xml:space="preserve"> sejak menjadi salah satu dari enam aturan yang diadopsi AICPA pada 1934—kecuali ketertagihan tak dapat diasumsikan wajar. Pengakuan saat kas terkumpul, melalui </w:t>
+        <w:t xml:space="preserve"> sejak menjadi salah satu dari enam aturan AICPA 1934—kecuali ketertagihan tak wajar diasumsikan. Pengakuan saat kas terkumpul, melalui </w:t>
       </w:r>
       <w:r>
         <w:rPr>
@@ -2272,7 +2272,7 @@
           <w:i w:val="0"/>
           <w:sz w:val="24"/>
         </w:rPr>
-        <w:t>, diizinkan SFAS No. 66 untuk real estat tanpa dasar wajar mengestimasi ketertagihan (Wolk et al., 2017, PDF hlm. 4).</w:t>
+        <w:t>, diizinkan SFAS No. 66 untuk real estat yang ketertagihannya tak terestimasi wajar (Wolk et al., 2017, PDF hlm. 4).</w:t>
       </w:r>
     </w:p>
     <w:p>
@@ -2287,7 +2287,7 @@
           <w:i w:val="0"/>
           <w:sz w:val="24"/>
         </w:rPr>
-        <w:t xml:space="preserve">Pengecualian terhadap norma penjualan berevolusi karena transaksi baru yang khas industri tertentu. Secara historis AICPA mengembangkan standar ini melalui </w:t>
+        <w:t xml:space="preserve">Pengecualian terhadap norma penjualan berevolusi karena transaksi baru khas industri. AICPA mengembangkan standarnya melalui </w:t>
       </w:r>
       <w:r>
         <w:rPr>
@@ -2323,7 +2323,7 @@
           <w:i w:val="0"/>
           <w:sz w:val="24"/>
         </w:rPr>
-        <w:t xml:space="preserve"> (SOP), namun karena dokumen tersebut tidak wajib dipatuhi sebagaimana standar FASB, praktiknya tidak konsisten (Wolk et al., 2017, PDF hlm. 5). Untuk menertibkannya, melalui SFAS No. 32 (1979) FASB meluncurkan program </w:t>
+        <w:t xml:space="preserve"> (SOP), namun karena tidak wajib dipatuhi, praktiknya tidak konsisten. Melalui SFAS No. 32 (1979) FASB meluncurkan program </w:t>
       </w:r>
       <w:r>
         <w:rPr>
@@ -2359,7 +2359,7 @@
           <w:i w:val="0"/>
           <w:sz w:val="24"/>
         </w:rPr>
-        <w:t xml:space="preserve"> dan SOP, memodifikasinya agar konsisten, lalu menerbitkannya sebagai SFAS—antara lain penjualan real estat (No. 66). Di luar empat titik resmi, literatur otoritatif </w:t>
+        <w:t xml:space="preserve"> dan SOP, memodifikasinya agar konsisten, lalu menerbitkannya sebagai SFAS—antara lain real estat (No. 66). Di luar empat titik resmi, literatur otoritatif </w:t>
       </w:r>
       <w:r>
         <w:rPr>
@@ -2413,7 +2413,7 @@
           <w:i w:val="0"/>
           <w:sz w:val="24"/>
         </w:rPr>
-        <w:t xml:space="preserve">) seperti pada kayu hutan maupun basis </w:t>
+        <w:t xml:space="preserve">) pada kayu hutan maupun basis </w:t>
       </w:r>
       <w:r>
         <w:rPr>
@@ -2464,7 +2464,7 @@
           <w:i w:val="0"/>
           <w:sz w:val="24"/>
         </w:rPr>
-        <w:t xml:space="preserve">Meski penjualan adalah norma, kriteria yang sesungguhnya diterapkan adalah </w:t>
+        <w:t xml:space="preserve">Meski penjualan adalah norma, kriteria sesungguhnya adalah </w:t>
       </w:r>
       <w:r>
         <w:rPr>
@@ -2500,7 +2500,7 @@
           <w:i w:val="0"/>
           <w:sz w:val="24"/>
         </w:rPr>
-        <w:t xml:space="preserve">): pendapatan diakui ketika peristiwa yang memuncaki proses itu terjadi. Namun pengukuran harus dituntaskan dahulu—tiga atribut harus terukur andal: (a) harga jual, (b) penerimaan kas, dan (c) biaya masa depan; bila ketiganya dapat diestimasi memadai, pendapatan diakui, jika tidak, ditunda (Wolk et al., 2017, PDF hlm. 5). Di titik inilah pengakuan menjadi </w:t>
+        <w:t xml:space="preserve">): pendapatan diakui ketika peristiwa yang memuncakinya terjadi. Namun pengukuran harus dituntaskan dahulu—tiga atribut harus terukur andal: (a) harga jual, (b) penerimaan kas, dan (c) biaya masa depan; bila dapat diestimasi memadai pendapatan diakui, jika tidak ditunda. Di titik inilah pengakuan menjadi </w:t>
       </w:r>
       <w:r>
         <w:rPr>
@@ -2536,7 +2536,7 @@
           <w:i w:val="0"/>
           <w:sz w:val="24"/>
         </w:rPr>
-        <w:t xml:space="preserve">. Contohnya adalah </w:t>
+        <w:t xml:space="preserve">: pada </w:t>
       </w:r>
       <w:r>
         <w:rPr>
@@ -2554,7 +2554,7 @@
           <w:i w:val="0"/>
           <w:sz w:val="24"/>
         </w:rPr>
-        <w:t xml:space="preserve"> kapasitas serat optik di telekomunikasi: </w:t>
+        <w:t xml:space="preserve"> kapasitas serat optik telekomunikasi, </w:t>
       </w:r>
       <w:r>
         <w:rPr>
@@ -2572,7 +2572,7 @@
           <w:i w:val="0"/>
           <w:sz w:val="24"/>
         </w:rPr>
-        <w:t xml:space="preserve"> membukukan seluruh "pendapatan" seketika sementara serat yang diperoleh dikapitalisasi dan dibebankan bertahun-tahun—padahal transaksi itu sekadar pertukaran aset yang penciptaan pendapatannya meragukan (Wolk et al., 2017, PDF hlm. 5).</w:t>
+        <w:t xml:space="preserve"> membukukan seluruh "pendapatan" seketika sementara serat diperoleh dikapitalisasi bertahun-tahun—padahal sekadar pertukaran aset (Wolk et al., 2017, PDF hlm. 5).</w:t>
       </w:r>
     </w:p>
     <w:p>
@@ -2587,7 +2587,7 @@
           <w:i w:val="0"/>
           <w:sz w:val="24"/>
         </w:rPr>
-        <w:t xml:space="preserve">Upaya konvergensi melahirkan standar bersama FASB–IASB, yakni </w:t>
+        <w:t xml:space="preserve">Upaya konvergensi melahirkan standar pendapatan tunggal bersama FASB–IASB, yakni </w:t>
       </w:r>
       <w:r>
         <w:rPr>
@@ -2623,7 +2623,7 @@
           <w:i w:val="0"/>
           <w:sz w:val="24"/>
         </w:rPr>
-        <w:t xml:space="preserve">, sebagai satu standar pendapatan tunggal (Wolk et al., 2017, PDF hlm. 6). Sebelumnya, menanggapi pelanggaran aturan pengakuan yang ditautkan pada </w:t>
+        <w:t xml:space="preserve">. Sebelumnya, menanggapi pelanggaran aturan pengakuan, SEC menerbitkan </w:t>
       </w:r>
       <w:r>
         <w:rPr>
@@ -2632,16 +2632,16 @@
           <w:i/>
           <w:sz w:val="24"/>
         </w:rPr>
-        <w:t>earnings management</w:t>
-      </w:r>
-      <w:r>
-        <w:rPr>
-          <w:rFonts w:ascii="Times New Roman" w:hAnsi="Times New Roman" w:cs="Times New Roman"/>
-          <w:b w:val="0"/>
-          <w:i w:val="0"/>
-          <w:sz w:val="24"/>
-        </w:rPr>
-        <w:t xml:space="preserve">, SEC menerbitkan </w:t>
+        <w:t>Staff Accounting Bulletin</w:t>
+      </w:r>
+      <w:r>
+        <w:rPr>
+          <w:rFonts w:ascii="Times New Roman" w:hAnsi="Times New Roman" w:cs="Times New Roman"/>
+          <w:b w:val="0"/>
+          <w:i w:val="0"/>
+          <w:sz w:val="24"/>
+        </w:rPr>
+        <w:t xml:space="preserve"> (SAB) 101; FASB justru mengkritiknya terlalu mengekang sehingga laporan laba rugi kurang berguna memprediksi arus kas—ketegangan institusional FASB–SEC yang berpotensi menjadi </w:t>
       </w:r>
       <w:r>
         <w:rPr>
@@ -2650,16 +2650,16 @@
           <w:i/>
           <w:sz w:val="24"/>
         </w:rPr>
-        <w:t>Staff Accounting Bulletin</w:t>
-      </w:r>
-      <w:r>
-        <w:rPr>
-          <w:rFonts w:ascii="Times New Roman" w:hAnsi="Times New Roman" w:cs="Times New Roman"/>
-          <w:b w:val="0"/>
-          <w:i w:val="0"/>
-          <w:sz w:val="24"/>
-        </w:rPr>
-        <w:t xml:space="preserve"> (SAB) 101. FASB justru mengkritiknya sebagai terlalu mengekang sehingga laporan laba rugi kurang berguna memprediksi arus kas—ketegangan institusional FASB–SEC yang berpotensi menjadi </w:t>
+        <w:t>showdown</w:t>
+      </w:r>
+      <w:r>
+        <w:rPr>
+          <w:rFonts w:ascii="Times New Roman" w:hAnsi="Times New Roman" w:cs="Times New Roman"/>
+          <w:b w:val="0"/>
+          <w:i w:val="0"/>
+          <w:sz w:val="24"/>
+        </w:rPr>
+        <w:t xml:space="preserve"> bila FASB mengarahkan pengakuan ke valuasi neraca (Wolk et al., 2017, PDF hlm. 6). Ketegangan reliabilitas versus </w:t>
       </w:r>
       <w:r>
         <w:rPr>
@@ -2668,24 +2668,6 @@
           <w:i/>
           <w:sz w:val="24"/>
         </w:rPr>
-        <w:t>showdown</w:t>
-      </w:r>
-      <w:r>
-        <w:rPr>
-          <w:rFonts w:ascii="Times New Roman" w:hAnsi="Times New Roman" w:cs="Times New Roman"/>
-          <w:b w:val="0"/>
-          <w:i w:val="0"/>
-          <w:sz w:val="24"/>
-        </w:rPr>
-        <w:t xml:space="preserve"> bila FASB mengarahkan pengakuan ke valuasi neraca (Wolk et al., 2017, PDF hlm. 6). Ketegangan antara aturan ketat demi reliabilitas dan keleluasaan demi </w:t>
-      </w:r>
-      <w:r>
-        <w:rPr>
-          <w:rFonts w:ascii="Times New Roman" w:hAnsi="Times New Roman" w:cs="Times New Roman"/>
-          <w:b w:val="0"/>
-          <w:i/>
-          <w:sz w:val="24"/>
-        </w:rPr>
         <w:t>decision usefulness</w:t>
       </w:r>
       <w:r>
@@ -2695,7 +2677,7 @@
           <w:i w:val="0"/>
           <w:sz w:val="24"/>
         </w:rPr>
-        <w:t xml:space="preserve"> inilah yang menjadi latar bagi pengakuan beban dan penandingan pada Bagian IV.</w:t>
+        <w:t xml:space="preserve"> inilah latar pengakuan beban dan penandingan pada Bagian IV.</w:t>
       </w:r>
     </w:p>
     <w:p>
@@ -7886,7 +7868,7 @@
           <w:i w:val="0"/>
           <w:sz w:val="24"/>
         </w:rPr>
-        <w:t xml:space="preserve">Sejumlah topik khusus mengilustrasikan bagaimana konsensus standar berevolusi lambat dan berdampak material, serta bagaimana ketiadaan kerangka teori konsisten menghambatnya (Wolk et al., 2017, PDF hlm. 18). Keempat kasus berikut adalah laboratorium tarik-menarik </w:t>
+        <w:t xml:space="preserve">Sejumlah topik khusus mengilustrasikan bagaimana konsensus standar berevolusi lambat dan berdampak material, terhambat ketiadaan kerangka teori konsisten (Wolk et al., 2017, PDF hlm. 18). Keempatnya menjadi laboratorium tarik-menarik </w:t>
       </w:r>
       <w:r>
         <w:rPr>
@@ -8006,7 +7988,7 @@
           <w:i w:val="0"/>
           <w:sz w:val="24"/>
         </w:rPr>
-        <w:t xml:space="preserve">) merintis usaha baru dan belum menghasilkan pendapatan berarti (Wolk et al., 2017, PDF hlm. 18). Sebelum 1976, entitas semacam ini menangguhkan biaya sementara entitas operasional membebankannya, melahirkan dua standar paralel. </w:t>
+        <w:t xml:space="preserve">) merintis usaha baru dan belum menghasilkan pendapatan berarti. Sebelum 1976, entitas ini menangguhkan biaya sementara entitas operasional membebankannya. </w:t>
       </w:r>
       <w:r>
         <w:rPr>
@@ -8024,7 +8006,7 @@
           <w:i w:val="0"/>
           <w:sz w:val="24"/>
         </w:rPr>
-        <w:t xml:space="preserve"> menetapkan bahwa </w:t>
+        <w:t xml:space="preserve"> menetapkan </w:t>
       </w:r>
       <w:r>
         <w:rPr>
@@ -8078,7 +8060,25 @@
           <w:i w:val="0"/>
           <w:sz w:val="24"/>
         </w:rPr>
-        <w:t>) di atas keseragaman terhingga (</w:t>
+        <w:t xml:space="preserve">) di atas </w:t>
+      </w:r>
+      <w:r>
+        <w:rPr>
+          <w:rFonts w:ascii="Times New Roman" w:hAnsi="Times New Roman" w:cs="Times New Roman"/>
+          <w:b/>
+          <w:i w:val="0"/>
+          <w:sz w:val="24"/>
+        </w:rPr>
+        <w:t>keseragaman terhingga</w:t>
+      </w:r>
+      <w:r>
+        <w:rPr>
+          <w:rFonts w:ascii="Times New Roman" w:hAnsi="Times New Roman" w:cs="Times New Roman"/>
+          <w:b w:val="0"/>
+          <w:i w:val="0"/>
+          <w:sz w:val="24"/>
+        </w:rPr>
+        <w:t xml:space="preserve"> (</w:t>
       </w:r>
       <w:r>
         <w:rPr>
@@ -8153,7 +8153,7 @@
           <w:i w:val="0"/>
           <w:sz w:val="24"/>
         </w:rPr>
-        <w:t xml:space="preserve">) terjadi ketika kreditor memberi konsesi yang normalnya tak diberikan karena kesulitan keuangan debitor (Wolk et al., 2017, PDF hlm. 19). </w:t>
+        <w:t xml:space="preserve">) terjadi ketika kreditor memberi konsesi karena kesulitan keuangan debitor. </w:t>
       </w:r>
       <w:r>
         <w:rPr>
@@ -8171,7 +8171,7 @@
           <w:i w:val="0"/>
           <w:sz w:val="24"/>
         </w:rPr>
-        <w:t xml:space="preserve"> disebut Wolk "kemenangan konsekuensi ekonomi atas kesetiaan representasional": selama arus kas masa depan </w:t>
+        <w:t xml:space="preserve"> disebut Wolk "kemenangan konsekuensi ekonomi atas kesetiaan representasional": selama arus kas </w:t>
       </w:r>
       <w:r>
         <w:rPr>
@@ -8189,7 +8189,7 @@
           <w:i w:val="0"/>
           <w:sz w:val="24"/>
         </w:rPr>
-        <w:t xml:space="preserve"> menutup nilai tercatat kewajiban, tidak ada untung-rugi diakui—padahal APB Opinion No. 21 telah menjadikan pendiskontoan praktik baku. </w:t>
+        <w:t xml:space="preserve"> menutup nilai tercatat kewajiban, tidak ada untung-rugi diakui—padahal APB Opinion No. 21 membakukan pendiskontoan. </w:t>
       </w:r>
       <w:r>
         <w:rPr>
@@ -8279,7 +8279,7 @@
           <w:i w:val="0"/>
           <w:sz w:val="24"/>
         </w:rPr>
-        <w:t xml:space="preserve">). Dua anggota FASB menolak, mengusulkan </w:t>
+        <w:t xml:space="preserve">); dua anggota FASB mengusulkan </w:t>
       </w:r>
       <w:r>
         <w:rPr>
@@ -8297,7 +8297,7 @@
           <w:i w:val="0"/>
           <w:sz w:val="24"/>
         </w:rPr>
-        <w:t xml:space="preserve">. Karena SFAS No. 114 hanya mengikat kreditor sedangkan debitor tetap tunduk pada SFAS No. 15, muncul </w:t>
+        <w:t xml:space="preserve">. Karena hanya kreditor terikat sedangkan debitor tetap tunduk SFAS No. 15, muncul </w:t>
       </w:r>
       <w:r>
         <w:rPr>
@@ -8315,7 +8315,7 @@
           <w:i w:val="0"/>
           <w:sz w:val="24"/>
         </w:rPr>
-        <w:t xml:space="preserve"> yang total—bukti, kata Wolk, bahwa "evolusi bisa menjadi proses yang lambat dan menyakitkan" (Wolk et al., 2017, PDF hlm. 19–20).</w:t>
+        <w:t xml:space="preserve"> total—"evolusi yang lambat dan menyakitkan" (Wolk et al., 2017, PDF hlm. 19–20).</w:t>
       </w:r>
     </w:p>
     <w:p>
@@ -8417,7 +8417,7 @@
           <w:i w:val="0"/>
           <w:sz w:val="24"/>
         </w:rPr>
-        <w:t xml:space="preserve"> dan semula menggolongkannya luar biasa, tetapi sembilan bulan kemudian </w:t>
+        <w:t xml:space="preserve"> dan semula menggolongkannya luar biasa, tetapi </w:t>
       </w:r>
       <w:r>
         <w:rPr>
@@ -8453,7 +8453,7 @@
           <w:i w:val="0"/>
           <w:sz w:val="24"/>
         </w:rPr>
-        <w:t xml:space="preserve"> luar biasa (Wolk et al., 2017, PDF hlm. 20). Akhirnya </w:t>
+        <w:t xml:space="preserve"> luar biasa. Akhirnya </w:t>
       </w:r>
       <w:r>
         <w:rPr>
@@ -8489,25 +8489,7 @@
           <w:i w:val="0"/>
           <w:sz w:val="24"/>
         </w:rPr>
-        <w:t xml:space="preserve">: penyusun standar mengalah kepada konstituennya atas </w:t>
-      </w:r>
-      <w:r>
-        <w:rPr>
-          <w:rFonts w:ascii="Times New Roman" w:hAnsi="Times New Roman" w:cs="Times New Roman"/>
-          <w:b/>
-          <w:i w:val="0"/>
-          <w:sz w:val="24"/>
-        </w:rPr>
-        <w:t>satu pos baris</w:t>
-      </w:r>
-      <w:r>
-        <w:rPr>
-          <w:rFonts w:ascii="Times New Roman" w:hAnsi="Times New Roman" w:cs="Times New Roman"/>
-          <w:b w:val="0"/>
-          <w:i w:val="0"/>
-          <w:sz w:val="24"/>
-        </w:rPr>
-        <w:t xml:space="preserve"> karena besarnya angka terlibat (Wolk et al., 2017, PDF hlm. 20).</w:t>
+        <w:t>, sebagai konsesi kepada konstituen (Wolk et al., 2017, PDF hlm. 20).</w:t>
       </w:r>
     </w:p>
     <w:p>
@@ -8564,7 +8546,7 @@
           <w:i w:val="0"/>
           <w:sz w:val="24"/>
         </w:rPr>
-        <w:t xml:space="preserve">) dirancang untuk </w:t>
+        <w:t xml:space="preserve">) dirancang </w:t>
       </w:r>
       <w:r>
         <w:rPr>
@@ -8582,7 +8564,7 @@
           <w:i w:val="0"/>
           <w:sz w:val="24"/>
         </w:rPr>
-        <w:t xml:space="preserve"> kepentingan manajemen dan pemegang saham (teori keagenan), namun mendorong manipulasi laba—kasus terburuknya </w:t>
+        <w:t xml:space="preserve"> kepentingan manajemen dan pemegang saham (teori keagenan), namun mendorong manipulasi laba—</w:t>
       </w:r>
       <w:r>
         <w:rPr>
@@ -8600,7 +8582,7 @@
           <w:i w:val="0"/>
           <w:sz w:val="24"/>
         </w:rPr>
-        <w:t xml:space="preserve"> yang mengapitalisasi beban biasa setidaknya </w:t>
+        <w:t xml:space="preserve"> mengapitalisasi beban setidaknya </w:t>
       </w:r>
       <w:r>
         <w:rPr>
@@ -8618,7 +8600,7 @@
           <w:i w:val="0"/>
           <w:sz w:val="24"/>
         </w:rPr>
-        <w:t xml:space="preserve"> (Wolk et al., 2017, PDF hlm. 20). </w:t>
+        <w:t xml:space="preserve">. </w:t>
       </w:r>
       <w:r>
         <w:rPr>
@@ -8708,7 +8690,7 @@
           <w:i w:val="0"/>
           <w:sz w:val="24"/>
         </w:rPr>
-        <w:t xml:space="preserve">) (Wolk et al., 2017, PDF hlm. 21). Pada Juni 1993 FASB menerbitkan </w:t>
+        <w:t xml:space="preserve">) (Wolk et al., 2017, PDF hlm. 20–21). Pada Juni 1993 FASB menerbitkan </w:t>
       </w:r>
       <w:r>
         <w:rPr>
@@ -8744,7 +8726,7 @@
           <w:i w:val="0"/>
           <w:sz w:val="24"/>
         </w:rPr>
-        <w:t xml:space="preserve">, namun kritik kesetiaan representasional dan pertempuran konsekuensi ekonomi dengan eksekutif keuangan menariknya pada </w:t>
+        <w:t xml:space="preserve">, namun kritik kesetiaan representasional dan tekanan eksekutif keuangan menariknya (Desember 1994). FASB lalu mundur ke pengungkapan catatan kaki via </w:t>
       </w:r>
       <w:r>
         <w:rPr>
@@ -8753,16 +8735,16 @@
           <w:i w:val="0"/>
           <w:sz w:val="24"/>
         </w:rPr>
-        <w:t>Desember 1994</w:t>
-      </w:r>
-      <w:r>
-        <w:rPr>
-          <w:rFonts w:ascii="Times New Roman" w:hAnsi="Times New Roman" w:cs="Times New Roman"/>
-          <w:b w:val="0"/>
-          <w:i w:val="0"/>
-          <w:sz w:val="24"/>
-        </w:rPr>
-        <w:t xml:space="preserve"> (Wolk et al., 2017, PDF hlm. 22). FASB lalu mundur ke pengungkapan catatan kaki via </w:t>
+        <w:t>SFAS No. 123</w:t>
+      </w:r>
+      <w:r>
+        <w:rPr>
+          <w:rFonts w:ascii="Times New Roman" w:hAnsi="Times New Roman" w:cs="Times New Roman"/>
+          <w:b w:val="0"/>
+          <w:i w:val="0"/>
+          <w:sz w:val="24"/>
+        </w:rPr>
+        <w:t xml:space="preserve">, sebelum </w:t>
       </w:r>
       <w:r>
         <w:rPr>
@@ -8771,16 +8753,16 @@
           <w:i w:val="0"/>
           <w:sz w:val="24"/>
         </w:rPr>
-        <w:t>SFAS No. 123</w:t>
-      </w:r>
-      <w:r>
-        <w:rPr>
-          <w:rFonts w:ascii="Times New Roman" w:hAnsi="Times New Roman" w:cs="Times New Roman"/>
-          <w:b w:val="0"/>
-          <w:i w:val="0"/>
-          <w:sz w:val="24"/>
-        </w:rPr>
-        <w:t xml:space="preserve">, sebelum </w:t>
+        <w:t>SFAS No. 123R</w:t>
+      </w:r>
+      <w:r>
+        <w:rPr>
+          <w:rFonts w:ascii="Times New Roman" w:hAnsi="Times New Roman" w:cs="Times New Roman"/>
+          <w:b w:val="0"/>
+          <w:i w:val="0"/>
+          <w:sz w:val="24"/>
+        </w:rPr>
+        <w:t xml:space="preserve"> (2004) mewajibkan pengakuan beban berdasarkan </w:t>
       </w:r>
       <w:r>
         <w:rPr>
@@ -8789,16 +8771,34 @@
           <w:i w:val="0"/>
           <w:sz w:val="24"/>
         </w:rPr>
-        <w:t>SFAS No. 123R</w:t>
-      </w:r>
-      <w:r>
-        <w:rPr>
-          <w:rFonts w:ascii="Times New Roman" w:hAnsi="Times New Roman" w:cs="Times New Roman"/>
-          <w:b w:val="0"/>
-          <w:i w:val="0"/>
-          <w:sz w:val="24"/>
-        </w:rPr>
-        <w:t xml:space="preserve"> (2004) mewajibkan pengakuan beban berdasarkan </w:t>
+        <w:t>nilai wajar tanggal pemberian</w:t>
+      </w:r>
+      <w:r>
+        <w:rPr>
+          <w:rFonts w:ascii="Times New Roman" w:hAnsi="Times New Roman" w:cs="Times New Roman"/>
+          <w:b w:val="0"/>
+          <w:i w:val="0"/>
+          <w:sz w:val="24"/>
+        </w:rPr>
+        <w:t xml:space="preserve"> (</w:t>
+      </w:r>
+      <w:r>
+        <w:rPr>
+          <w:rFonts w:ascii="Times New Roman" w:hAnsi="Times New Roman" w:cs="Times New Roman"/>
+          <w:b w:val="0"/>
+          <w:i/>
+          <w:sz w:val="24"/>
+        </w:rPr>
+        <w:t>grant-date fair value</w:t>
+      </w:r>
+      <w:r>
+        <w:rPr>
+          <w:rFonts w:ascii="Times New Roman" w:hAnsi="Times New Roman" w:cs="Times New Roman"/>
+          <w:b w:val="0"/>
+          <w:i w:val="0"/>
+          <w:sz w:val="24"/>
+        </w:rPr>
+        <w:t xml:space="preserve">)—dekat </w:t>
       </w:r>
       <w:r>
         <w:rPr>
@@ -8807,34 +8807,16 @@
           <w:i w:val="0"/>
           <w:sz w:val="24"/>
         </w:rPr>
-        <w:t>nilai wajar tanggal pemberian</w:t>
-      </w:r>
-      <w:r>
-        <w:rPr>
-          <w:rFonts w:ascii="Times New Roman" w:hAnsi="Times New Roman" w:cs="Times New Roman"/>
-          <w:b w:val="0"/>
-          <w:i w:val="0"/>
-          <w:sz w:val="24"/>
-        </w:rPr>
-        <w:t xml:space="preserve"> (</w:t>
-      </w:r>
-      <w:r>
-        <w:rPr>
-          <w:rFonts w:ascii="Times New Roman" w:hAnsi="Times New Roman" w:cs="Times New Roman"/>
-          <w:b w:val="0"/>
-          <w:i/>
-          <w:sz w:val="24"/>
-        </w:rPr>
-        <w:t>grant-date fair value</w:t>
-      </w:r>
-      <w:r>
-        <w:rPr>
-          <w:rFonts w:ascii="Times New Roman" w:hAnsi="Times New Roman" w:cs="Times New Roman"/>
-          <w:b w:val="0"/>
-          <w:i w:val="0"/>
-          <w:sz w:val="24"/>
-        </w:rPr>
-        <w:t xml:space="preserve">)—sangat dekat dengan </w:t>
+        <w:t>IFRS 2</w:t>
+      </w:r>
+      <w:r>
+        <w:rPr>
+          <w:rFonts w:ascii="Times New Roman" w:hAnsi="Times New Roman" w:cs="Times New Roman"/>
+          <w:b w:val="0"/>
+          <w:i w:val="0"/>
+          <w:sz w:val="24"/>
+        </w:rPr>
+        <w:t xml:space="preserve"> (Wolk et al., 2017, PDF hlm. 22–23). Praktik </w:t>
       </w:r>
       <w:r>
         <w:rPr>
@@ -8843,16 +8825,16 @@
           <w:i w:val="0"/>
           <w:sz w:val="24"/>
         </w:rPr>
-        <w:t>IFRS 2</w:t>
-      </w:r>
-      <w:r>
-        <w:rPr>
-          <w:rFonts w:ascii="Times New Roman" w:hAnsi="Times New Roman" w:cs="Times New Roman"/>
-          <w:b w:val="0"/>
-          <w:i w:val="0"/>
-          <w:sz w:val="24"/>
-        </w:rPr>
-        <w:t xml:space="preserve"> (Wolk et al., 2017, PDF hlm. 23). Praktik </w:t>
+        <w:t>backdating</w:t>
+      </w:r>
+      <w:r>
+        <w:rPr>
+          <w:rFonts w:ascii="Times New Roman" w:hAnsi="Times New Roman" w:cs="Times New Roman"/>
+          <w:b w:val="0"/>
+          <w:i w:val="0"/>
+          <w:sz w:val="24"/>
+        </w:rPr>
+        <w:t xml:space="preserve"> ke harga terendah menambah problem; Efendi et al. (2012) menemukan </w:t>
       </w:r>
       <w:r>
         <w:rPr>
@@ -8861,24 +8843,6 @@
           <w:i w:val="0"/>
           <w:sz w:val="24"/>
         </w:rPr>
-        <w:t>backdating</w:t>
-      </w:r>
-      <w:r>
-        <w:rPr>
-          <w:rFonts w:ascii="Times New Roman" w:hAnsi="Times New Roman" w:cs="Times New Roman"/>
-          <w:b w:val="0"/>
-          <w:i w:val="0"/>
-          <w:sz w:val="24"/>
-        </w:rPr>
-        <w:t xml:space="preserve"> ke titik harga terendah tahun itu menambah problem; Efendi et al. (2012) menemukan </w:t>
-      </w:r>
-      <w:r>
-        <w:rPr>
-          <w:rFonts w:ascii="Times New Roman" w:hAnsi="Times New Roman" w:cs="Times New Roman"/>
-          <w:b/>
-          <w:i w:val="0"/>
-          <w:sz w:val="24"/>
-        </w:rPr>
         <w:t>pergantian paksa CEO dan CFO</w:t>
       </w:r>
       <w:r>
@@ -8888,7 +8852,7 @@
           <w:i w:val="0"/>
           <w:sz w:val="24"/>
         </w:rPr>
-        <w:t xml:space="preserve"> lebih tinggi setelahnya (Wolk et al., 2017, PDF hlm. 23).</w:t>
+        <w:t xml:space="preserve"> lebih tinggi.</w:t>
       </w:r>
     </w:p>
     <w:p>
@@ -9018,7 +8982,7 @@
           <w:i w:val="0"/>
           <w:sz w:val="24"/>
         </w:rPr>
-        <w:t xml:space="preserve">), penerima opsi adalah pemilik sehingga biayanya hanya biaya peluang yang tidak dipandang beban; di bawah </w:t>
+        <w:t xml:space="preserve">), penerima opsi adalah pemilik sehingga biayanya hanya biaya peluang, bukan beban; di bawah </w:t>
       </w:r>
       <w:r>
         <w:rPr>
@@ -9108,7 +9072,7 @@
           <w:i w:val="0"/>
           <w:sz w:val="24"/>
         </w:rPr>
-        <w:t xml:space="preserve">) dihitung tanpa beban bunga, lalu dikurangi biaya bunga dan biaya opsi menjadi </w:t>
+        <w:t xml:space="preserve">) tanpa beban bunga, dikurangi biaya bunga dan opsi menjadi </w:t>
       </w:r>
       <w:r>
         <w:rPr>
@@ -9144,7 +9108,7 @@
           <w:i w:val="0"/>
           <w:sz w:val="24"/>
         </w:rPr>
-        <w:t xml:space="preserve">), sekaligus memberi </w:t>
+        <w:t xml:space="preserve">), sekaligus </w:t>
       </w:r>
       <w:r>
         <w:rPr>
@@ -9153,16 +9117,16 @@
           <w:i w:val="0"/>
           <w:sz w:val="24"/>
         </w:rPr>
-        <w:t>artikulasi</w:t>
-      </w:r>
-      <w:r>
-        <w:rPr>
-          <w:rFonts w:ascii="Times New Roman" w:hAnsi="Times New Roman" w:cs="Times New Roman"/>
-          <w:b w:val="0"/>
-          <w:i w:val="0"/>
-          <w:sz w:val="24"/>
-        </w:rPr>
-        <w:t xml:space="preserve"> dengan arus kas (Wolk et al., 2017, PDF hlm. 23–24). Ketika diskresi dibiarkan terbuka, pengukuran laba menjelma menjadi alat </w:t>
+        <w:t>berartikulasi</w:t>
+      </w:r>
+      <w:r>
+        <w:rPr>
+          <w:rFonts w:ascii="Times New Roman" w:hAnsi="Times New Roman" w:cs="Times New Roman"/>
+          <w:b w:val="0"/>
+          <w:i w:val="0"/>
+          <w:sz w:val="24"/>
+        </w:rPr>
+        <w:t xml:space="preserve"> dengan arus kas (Wolk et al., 2017, PDF hlm. 23–24). Ketika diskresi terbuka, pengukuran laba menjelma alat </w:t>
       </w:r>
       <w:r>
         <w:rPr>
@@ -9180,7 +9144,7 @@
           <w:i w:val="0"/>
           <w:sz w:val="24"/>
         </w:rPr>
-        <w:t>—pokok Bagian XI.</w:t>
+        <w:t>—Bagian XI.</w:t>
       </w:r>
     </w:p>
     <w:p>
@@ -9336,16 +9300,16 @@
           <w:i w:val="0"/>
           <w:sz w:val="24"/>
         </w:rPr>
-        <w:t>meminimalkan laba yang dilaporkan</w:t>
-      </w:r>
-      <w:r>
-        <w:rPr>
-          <w:rFonts w:ascii="Times New Roman" w:hAnsi="Times New Roman" w:cs="Times New Roman"/>
-          <w:b w:val="0"/>
-          <w:i w:val="0"/>
-          <w:sz w:val="24"/>
-        </w:rPr>
-        <w:t xml:space="preserve"> guna mengurangi campur tangan pemerintah bila visibilitas politiknya tinggi. Terdapat pula asimetri mencolok di sekitar </w:t>
+        <w:t>meminimalkan laba dilaporkan</w:t>
+      </w:r>
+      <w:r>
+        <w:rPr>
+          <w:rFonts w:ascii="Times New Roman" w:hAnsi="Times New Roman" w:cs="Times New Roman"/>
+          <w:b w:val="0"/>
+          <w:i w:val="0"/>
+          <w:sz w:val="24"/>
+        </w:rPr>
+        <w:t xml:space="preserve"> guna mengurangi campur tangan pemerintah bila visibilitas politiknya tinggi. Terdapat pula asimetri di sekitar </w:t>
       </w:r>
       <w:r>
         <w:rPr>
@@ -9363,7 +9327,7 @@
           <w:i w:val="0"/>
           <w:sz w:val="24"/>
         </w:rPr>
-        <w:t xml:space="preserve">: jauh lebih banyak laba kuartalan yang tepat melampaui ekspektasi ketimbang yang sedikit meleset di bawahnya—menegaskan dimensi </w:t>
+        <w:t xml:space="preserve">: jauh lebih banyak laba kuartalan tepat melampaui ekspektasi ketimbang sedikit meleset—menegaskan dimensi </w:t>
       </w:r>
       <w:r>
         <w:rPr>
@@ -9381,7 +9345,7 @@
           <w:i w:val="0"/>
           <w:sz w:val="24"/>
         </w:rPr>
-        <w:t>, sebab laba yang dikelola pada hakikatnya informasi orang dalam (Wolk et al., 2017, PDF hlm. 24).</w:t>
+        <w:t>, sebab laba dikelola hakikatnya informasi orang dalam.</w:t>
       </w:r>
     </w:p>
     <w:p>
@@ -9511,7 +9475,7 @@
           <w:i w:val="0"/>
           <w:sz w:val="24"/>
         </w:rPr>
-        <w:t xml:space="preserve">): komponen biaya inti digeser ke segmen bawah laporan laba rugi sehingga marjin laba kotor membaik sementara total laba tetap; contoh anekdotalnya pengajuan SEC Borden Incorporated 1992 ketika </w:t>
+        <w:t xml:space="preserve">): komponen biaya inti digeser ke segmen bawah laporan laba rugi sehingga marjin laba kotor membaik sementara total laba tetap; contohnya pengajuan SEC Borden Incorporated 1992 ketika </w:t>
       </w:r>
       <w:r>
         <w:rPr>
@@ -9547,7 +9511,7 @@
           <w:i w:val="0"/>
           <w:sz w:val="24"/>
         </w:rPr>
-        <w:t xml:space="preserve"> (Wolk et al., 2017, PDF hlm. 24–25). Beragam motif lain terdokumentasi: Erickson dan Wang menemukan pengakuisisi menaikkan laba sebelum akuisisi saham agar saham yang ditukar berkurang, sementara Wu menemukan laba dimanipulasi turun menjelang </w:t>
+        <w:t xml:space="preserve"> (Wolk et al., 2017, PDF hlm. 24). Motif lain terdokumentasi: Erickson dan Wang menemukan pengakuisisi menaikkan laba sebelum akuisisi saham agar saham ditukar berkurang, sementara Wu menemukan laba dimanipulasi turun menjelang </w:t>
       </w:r>
       <w:r>
         <w:rPr>
@@ -9565,7 +9529,7 @@
           <w:i w:val="0"/>
           <w:sz w:val="24"/>
         </w:rPr>
-        <w:t xml:space="preserve">—berlawanan dengan DeAngelo yang tidak menemukan understatement. Kasznik menemukan perusahaan yang memberi prakiraan laba sukarela cenderung menaikkan laba dengan menurunkan </w:t>
+        <w:t xml:space="preserve">—berlawanan dengan DeAngelo. Kasznik menemukan pemberi prakiraan laba sukarela menaikkan laba dengan menurunkan </w:t>
       </w:r>
       <w:r>
         <w:rPr>
@@ -9583,7 +9547,7 @@
           <w:i w:val="0"/>
           <w:sz w:val="24"/>
         </w:rPr>
-        <w:t xml:space="preserve"> bila prakiraan terlalu tinggi (Wolk et al., 2017, PDF hlm. 25). Deteksinya sukar, namun SEC memandangnya masalah serius. Studi Nelson, Elliott, dan Tarpley—menanyai auditor sebuah firma Big Five—menunjukkan tegangan regulatoris: </w:t>
+        <w:t xml:space="preserve"> bila prakiraan terlalu tinggi. Deteksinya sukar; studi Nelson, Elliott, dan Tarpley menunjukkan tegangan regulatoris, </w:t>
       </w:r>
       <w:r>
         <w:rPr>
@@ -9592,16 +9556,16 @@
           <w:i w:val="0"/>
           <w:sz w:val="24"/>
         </w:rPr>
-        <w:t>standar yang tidak presisi</w:t>
-      </w:r>
-      <w:r>
-        <w:rPr>
-          <w:rFonts w:ascii="Times New Roman" w:hAnsi="Times New Roman" w:cs="Times New Roman"/>
-          <w:b w:val="0"/>
-          <w:i w:val="0"/>
-          <w:sz w:val="24"/>
-        </w:rPr>
-        <w:t xml:space="preserve"> mengundang manipulasi cadangan, sedangkan </w:t>
+        <w:t>standar tidak presisi</w:t>
+      </w:r>
+      <w:r>
+        <w:rPr>
+          <w:rFonts w:ascii="Times New Roman" w:hAnsi="Times New Roman" w:cs="Times New Roman"/>
+          <w:b w:val="0"/>
+          <w:i w:val="0"/>
+          <w:sz w:val="24"/>
+        </w:rPr>
+        <w:t xml:space="preserve"> mengundang manipulasi cadangan sedangkan </w:t>
       </w:r>
       <w:r>
         <w:rPr>
@@ -9610,7 +9574,7 @@
           <w:i w:val="0"/>
           <w:sz w:val="24"/>
         </w:rPr>
-        <w:t>standar yang presisi</w:t>
+        <w:t>standar presisi</w:t>
       </w:r>
       <w:r>
         <w:rPr>
@@ -9706,7 +9670,7 @@
           <w:i w:val="0"/>
           <w:sz w:val="24"/>
         </w:rPr>
-        <w:t xml:space="preserve">)—di antara keduanya bonus adalah persentase laba, di atas plafon bonus maksimal, dan di bawah lantai tak ada bonus (Wolk et al., 2017, PDF hlm. 26). Healy, dalam studi yang kerap dikutip, menemukan bahwa di atas plafon dan di bawah lantai, laba </w:t>
+        <w:t xml:space="preserve">) (Wolk et al., 2017, PDF hlm. 26). Healy, dalam studi yang kerap dikutip, menemukan di atas plafon dan di bawah lantai laba </w:t>
       </w:r>
       <w:r>
         <w:rPr>
@@ -9760,7 +9724,7 @@
           <w:i w:val="0"/>
           <w:sz w:val="24"/>
         </w:rPr>
-        <w:t xml:space="preserve">)—seperti beban piutang tak tertagih, penambahan produksi untuk menyerap overhead manufaktur tetap, dan estimasi beban garansi—dapat dikendalikan jangka pendek tetapi sulit dibedakan dari </w:t>
+        <w:t xml:space="preserve">)—beban piutang tak tertagih, penambahan produksi penyerap overhead manufaktur tetap, dan estimasi beban garansi—dapat dikendalikan jangka pendek tetapi sulit dibedakan dari </w:t>
       </w:r>
       <w:r>
         <w:rPr>
@@ -9778,7 +9742,7 @@
           <w:i w:val="0"/>
           <w:sz w:val="24"/>
         </w:rPr>
-        <w:t>; di luar itu ada pengendalian biaya riil seperti iklan dan litbang (Wolk et al., 2017, PDF hlm. 26).</w:t>
+        <w:t>; di luar itu ada pengendalian biaya riil seperti iklan dan litbang.</w:t>
       </w:r>
     </w:p>
     <w:p>
@@ -9856,7 +9820,7 @@
           <w:i w:val="0"/>
           <w:sz w:val="24"/>
         </w:rPr>
-        <w:t xml:space="preserve">) lebih tinggi—mengandaikan pasar saham naif; alternatifnya, Ronen dan Sadan menafsirkannya sebagai upaya </w:t>
+        <w:t xml:space="preserve">) lebih tinggi—mengandaikan pasar naif; alternatifnya, Ronen dan Sadan menafsirkannya sebagai upaya </w:t>
       </w:r>
       <w:r>
         <w:rPr>
@@ -9874,7 +9838,7 @@
           <w:i w:val="0"/>
           <w:sz w:val="24"/>
         </w:rPr>
-        <w:t xml:space="preserve"> arus kas masa depan oleh pihak luar (Wolk et al., 2017, PDF hlm. 26). Perataan dicapai melalui tiga mekanisme: </w:t>
+        <w:t xml:space="preserve"> arus kas masa depan (Wolk et al., 2017, PDF hlm. 26). Perataan dicapai melalui tiga mekanisme: </w:t>
       </w:r>
       <w:r>
         <w:rPr>
@@ -9928,7 +9892,7 @@
           <w:i w:val="0"/>
           <w:sz w:val="24"/>
         </w:rPr>
-        <w:t xml:space="preserve"> antara laba operasi dan nonoperasi—yang setelah APB Opinion No. 30 nyaris tak menyisakan diskresi (Wolk et al., 2017, PDF hlm. 27). Chaney dan Jeter menemukan perusahaan perata cenderung lebih besar dengan akrual diskresioner absolut lebih besar, sementara DeFond dan Park menemukan pola "</w:t>
+        <w:t xml:space="preserve"> laba operasi versus nonoperasi—yang setelah APB Opinion No. 30 nyaris tak bersisa. Chaney dan Jeter menemukan perusahaan perata cenderung lebih besar dengan akrual diskresioner absolut lebih besar, sementara DeFond dan Park menemukan pola "</w:t>
       </w:r>
       <w:r>
         <w:rPr>
@@ -9964,7 +9928,7 @@
           <w:i w:val="0"/>
           <w:sz w:val="24"/>
         </w:rPr>
-        <w:t xml:space="preserve">" laba saat prospek suram. Namun literatur ini menyimpan tiga masalah: motivasi perataan tidak cukup tegas untuk memprediksi rupa laba teratakan, laba </w:t>
+        <w:t xml:space="preserve">"-nya saat prospek suram. Namun literatur ini menyimpan tiga masalah: motivasinya tidak cukup tegas memprediksi rupa laba teratakan, laba </w:t>
       </w:r>
       <w:r>
         <w:rPr>
@@ -9982,7 +9946,7 @@
           <w:i w:val="0"/>
           <w:sz w:val="24"/>
         </w:rPr>
-        <w:t xml:space="preserve"> tidak dapat dihitung, dan inflasi menimbulkan drift naik yang melebih-lebihkan perataan (Wolk et al., 2017, PDF hlm. 27). Studi </w:t>
+        <w:t xml:space="preserve"> tidak terhitung, dan inflasi menimbulkan drift naik yang melebih-lebihkan perataan. Studi </w:t>
       </w:r>
       <w:r>
         <w:rPr>
@@ -10018,7 +9982,7 @@
           <w:i w:val="0"/>
           <w:sz w:val="24"/>
         </w:rPr>
-        <w:t xml:space="preserve"> dengan sedikit drift naik—prediksi terbaik laba kini adalah laba periode lalu—dan ini </w:t>
+        <w:t xml:space="preserve"> dengan sedikit drift naik dan ini </w:t>
       </w:r>
       <w:r>
         <w:rPr>
@@ -10036,7 +10000,7 @@
           <w:i w:val="0"/>
           <w:sz w:val="24"/>
         </w:rPr>
-        <w:t xml:space="preserve"> hipotesis perataan, sebab jika perataan masif, model rata-rata bergerak semestinya mengungguli random walk (Wolk et al., 2017, PDF hlm. 27). Dengan demikian, manajemen laba dan perataan menutup pembahasan kualitas pengukuran laba sekaligus menyiapkan Bagian XII tentang pengakuan dan penyajiannya.</w:t>
+        <w:t xml:space="preserve"> hipotesis perataan, sebab jika perataan masif, model rata-rata bergerak semestinya mengungguli random walk (Wolk et al., 2017, PDF hlm. 27). Manajemen laba dan perataan menutup kualitas pengukuran laba sekaligus menyiapkan Bagian XII.</w:t>
       </w:r>
     </w:p>
     <w:p>

</xml_diff>